<commit_message>
Grade 11 Biology: drift fixes, FE rebuild + triage, FE-GRADE validator check
Co-Authored-By: Claude Sonnet 5.5 <noreply@anthropic.com>
</commit_message>
<xml_diff>
--- a/data/outputs/v2/Grade11/Biology/Lesson_Plans/SS1.1_Taxonomy_I/Biology_Taxonomy_I_CBE_LessonSequence.docx
+++ b/data/outputs/v2/Grade11/Biology/Lesson_Plans/SS1.1_Taxonomy_I/Biology_Taxonomy_I_CBE_LessonSequence.docx
@@ -2073,7 +2073,7 @@
         </w:rPr>
         <w:t xml:space="preserve">© 2026 SeaVuria and ARES. This work is licensed under a </w:t>
       </w:r>
-      <w:hyperlink w:history="1" r:id="rIdqcmzcujxh2widgisfdlav">
+      <w:hyperlink w:history="1" r:id="rIdkw2ej-dav4pw10huxsqs4">
         <w:r>
           <w:rPr>
             <w:rFonts w:ascii="Arial" w:cs="Arial" w:eastAsia="Arial" w:hAnsi="Arial"/>
@@ -2093,7 +2093,7 @@
         </w:rPr>
         <w:t xml:space="preserve"> (</w:t>
       </w:r>
-      <w:hyperlink w:history="1" r:id="rIdovusp5uby5d_kqarpdglp">
+      <w:hyperlink w:history="1" r:id="rIdrzopbia1lx8dkjueveru2">
         <w:r>
           <w:rPr>
             <w:rFonts w:ascii="Arial" w:cs="Arial" w:eastAsia="Arial" w:hAnsi="Arial"/>
@@ -2113,7 +2113,7 @@
         </w:rPr>
         <w:t xml:space="preserve">). To view a copy of this license, visit </w:t>
       </w:r>
-      <w:hyperlink w:history="1" r:id="rIdluhaxxq4ij2lpgv2ikx0-">
+      <w:hyperlink w:history="1" r:id="rIdxnnzibg14ti1p8lddd36r">
         <w:r>
           <w:rPr>
             <w:rFonts w:ascii="Arial" w:cs="Arial" w:eastAsia="Arial" w:hAnsi="Arial"/>
@@ -3125,7 +3125,7 @@
             <w:pPr>
               <w:spacing w:after="20" w:before="0"/>
             </w:pPr>
-            <w:hyperlink w:history="1" r:id="rIdsf-loctkun6d-kmzwzqbu">
+            <w:hyperlink w:history="1" r:id="rIdn39tcnu5eawze8xlpztrf">
               <w:r>
                 <w:rPr>
                   <w:rFonts w:ascii="Arial" w:cs="Arial" w:eastAsia="Arial" w:hAnsi="Arial"/>
@@ -3174,7 +3174,7 @@
               <w:spacing w:after="10" w:before="0"/>
               <w:ind w:left="120"/>
             </w:pPr>
-            <w:hyperlink w:history="1" r:id="rIdal7f10eh_1epgczu-bl1h">
+            <w:hyperlink w:history="1" r:id="rIdw2ihpoal3qojnmta-ckgw">
               <w:r>
                 <w:rPr>
                   <w:rFonts w:ascii="Arial" w:cs="Arial" w:eastAsia="Arial" w:hAnsi="Arial"/>
@@ -3219,7 +3219,7 @@
             <w:pPr>
               <w:spacing w:after="20" w:before="0"/>
             </w:pPr>
-            <w:hyperlink w:history="1" r:id="rIdplz43s656tfvlg7c22uqk">
+            <w:hyperlink w:history="1" r:id="rIdilo0wgzuljzsyqtov_l36">
               <w:r>
                 <w:rPr>
                   <w:rFonts w:ascii="Arial" w:cs="Arial" w:eastAsia="Arial" w:hAnsi="Arial"/>
@@ -3252,7 +3252,7 @@
               <w:spacing w:after="10" w:before="0"/>
               <w:ind w:left="120"/>
             </w:pPr>
-            <w:hyperlink w:history="1" r:id="rIdqyyobyek3jgp_iz0daii-">
+            <w:hyperlink w:history="1" r:id="rIdqt0lfxfjhe3egtwlfg1ae">
               <w:r>
                 <w:rPr>
                   <w:rFonts w:ascii="Arial" w:cs="Arial" w:eastAsia="Arial" w:hAnsi="Arial"/>
@@ -3447,7 +3447,7 @@
             <w:pPr>
               <w:spacing w:after="20" w:before="0"/>
             </w:pPr>
-            <w:hyperlink w:history="1" r:id="rIdv84xitcpkdsdl3abwkhbd">
+            <w:hyperlink w:history="1" r:id="rIdvm_hinn-e9lhyecaecyzm">
               <w:r>
                 <w:rPr>
                   <w:rFonts w:ascii="Arial" w:cs="Arial" w:eastAsia="Arial" w:hAnsi="Arial"/>
@@ -3496,7 +3496,7 @@
               <w:spacing w:after="10" w:before="0"/>
               <w:ind w:left="120"/>
             </w:pPr>
-            <w:hyperlink w:history="1" r:id="rIdpsnk8qj5j884l8ahmqdpu">
+            <w:hyperlink w:history="1" r:id="rIdyfxcueax75s-j4ksw5zv0">
               <w:r>
                 <w:rPr>
                   <w:rFonts w:ascii="Arial" w:cs="Arial" w:eastAsia="Arial" w:hAnsi="Arial"/>
@@ -3541,7 +3541,7 @@
             <w:pPr>
               <w:spacing w:after="20" w:before="0"/>
             </w:pPr>
-            <w:hyperlink w:history="1" r:id="rIdtsfl1sdtkk81mrgxr6vw2">
+            <w:hyperlink w:history="1" r:id="rIdt7vuiuzesz0f_t_g2agfr">
               <w:r>
                 <w:rPr>
                   <w:rFonts w:ascii="Arial" w:cs="Arial" w:eastAsia="Arial" w:hAnsi="Arial"/>
@@ -3574,7 +3574,7 @@
               <w:spacing w:after="10" w:before="0"/>
               <w:ind w:left="120"/>
             </w:pPr>
-            <w:hyperlink w:history="1" r:id="rIdoj9m701evz436lwqbwgcq">
+            <w:hyperlink w:history="1" r:id="rIds_lz-bvzlxxejignwm52j">
               <w:r>
                 <w:rPr>
                   <w:rFonts w:ascii="Arial" w:cs="Arial" w:eastAsia="Arial" w:hAnsi="Arial"/>
@@ -3769,7 +3769,7 @@
             <w:pPr>
               <w:spacing w:after="20" w:before="0"/>
             </w:pPr>
-            <w:hyperlink w:history="1" r:id="rId7ugr0nclz32tushveebp1">
+            <w:hyperlink w:history="1" r:id="rIdaem0bj262bibxo_hoihaf">
               <w:r>
                 <w:rPr>
                   <w:rFonts w:ascii="Arial" w:cs="Arial" w:eastAsia="Arial" w:hAnsi="Arial"/>
@@ -3818,7 +3818,7 @@
               <w:spacing w:after="10" w:before="0"/>
               <w:ind w:left="120"/>
             </w:pPr>
-            <w:hyperlink w:history="1" r:id="rIdackshyejdc80e1n5szyf3">
+            <w:hyperlink w:history="1" r:id="rId_k1yuuug2kzq4tpxsu7py">
               <w:r>
                 <w:rPr>
                   <w:rFonts w:ascii="Arial" w:cs="Arial" w:eastAsia="Arial" w:hAnsi="Arial"/>
@@ -3863,7 +3863,7 @@
             <w:pPr>
               <w:spacing w:after="20" w:before="0"/>
             </w:pPr>
-            <w:hyperlink w:history="1" r:id="rIdnh-thot5piqcjwtv8g2eq">
+            <w:hyperlink w:history="1" r:id="rIddqliy6oifvzreoejtqg99">
               <w:r>
                 <w:rPr>
                   <w:rFonts w:ascii="Arial" w:cs="Arial" w:eastAsia="Arial" w:hAnsi="Arial"/>
@@ -3896,7 +3896,7 @@
               <w:spacing w:after="10" w:before="0"/>
               <w:ind w:left="120"/>
             </w:pPr>
-            <w:hyperlink w:history="1" r:id="rIdyur-ailsa-zfjjy_qbk_l">
+            <w:hyperlink w:history="1" r:id="rIdsp5nplsv4rhraaxypeqsd">
               <w:r>
                 <w:rPr>
                   <w:rFonts w:ascii="Arial" w:cs="Arial" w:eastAsia="Arial" w:hAnsi="Arial"/>
@@ -4091,7 +4091,7 @@
             <w:pPr>
               <w:spacing w:after="20" w:before="0"/>
             </w:pPr>
-            <w:hyperlink w:history="1" r:id="rIdq2bmnytuainvwrnpfopmo">
+            <w:hyperlink w:history="1" r:id="rId3ywszs40bytzyxewwakyx">
               <w:r>
                 <w:rPr>
                   <w:rFonts w:ascii="Arial" w:cs="Arial" w:eastAsia="Arial" w:hAnsi="Arial"/>
@@ -4140,7 +4140,7 @@
               <w:spacing w:after="10" w:before="0"/>
               <w:ind w:left="120"/>
             </w:pPr>
-            <w:hyperlink w:history="1" r:id="rIdh9ymuhs0xddrjqjvjbtrc">
+            <w:hyperlink w:history="1" r:id="rIdrq2n3djlwtabuxv_wdfc5">
               <w:r>
                 <w:rPr>
                   <w:rFonts w:ascii="Arial" w:cs="Arial" w:eastAsia="Arial" w:hAnsi="Arial"/>
@@ -4185,7 +4185,7 @@
             <w:pPr>
               <w:spacing w:after="20" w:before="0"/>
             </w:pPr>
-            <w:hyperlink w:history="1" r:id="rId_llwoluakilj20s4cblvd">
+            <w:hyperlink w:history="1" r:id="rIdzgxedwclgbbgnw6leid35">
               <w:r>
                 <w:rPr>
                   <w:rFonts w:ascii="Arial" w:cs="Arial" w:eastAsia="Arial" w:hAnsi="Arial"/>
@@ -4218,7 +4218,7 @@
               <w:spacing w:after="10" w:before="0"/>
               <w:ind w:left="120"/>
             </w:pPr>
-            <w:hyperlink w:history="1" r:id="rIdm-k_iztfnegpgowhy9vnt">
+            <w:hyperlink w:history="1" r:id="rIdujcuyowokd8tfo_ehr49c">
               <w:r>
                 <w:rPr>
                   <w:rFonts w:ascii="Arial" w:cs="Arial" w:eastAsia="Arial" w:hAnsi="Arial"/>
@@ -4413,7 +4413,7 @@
             <w:pPr>
               <w:spacing w:after="20" w:before="0"/>
             </w:pPr>
-            <w:hyperlink w:history="1" r:id="rIdhucihgzpgvnthq_len0eo">
+            <w:hyperlink w:history="1" r:id="rIdv9k5tw2esvlmsfgq5lu4r">
               <w:r>
                 <w:rPr>
                   <w:rFonts w:ascii="Arial" w:cs="Arial" w:eastAsia="Arial" w:hAnsi="Arial"/>
@@ -4462,7 +4462,7 @@
               <w:spacing w:after="10" w:before="0"/>
               <w:ind w:left="120"/>
             </w:pPr>
-            <w:hyperlink w:history="1" r:id="rId0ebpqxe3ljcybd9uuknyd">
+            <w:hyperlink w:history="1" r:id="rIdmb1asktldd_-fnuhvnwtz">
               <w:r>
                 <w:rPr>
                   <w:rFonts w:ascii="Arial" w:cs="Arial" w:eastAsia="Arial" w:hAnsi="Arial"/>
@@ -4507,7 +4507,7 @@
             <w:pPr>
               <w:spacing w:after="20" w:before="0"/>
             </w:pPr>
-            <w:hyperlink w:history="1" r:id="rId9kfr_uq4gjwg3vp_xoqs4">
+            <w:hyperlink w:history="1" r:id="rIdo2jvdheetmqyoxzogsamg">
               <w:r>
                 <w:rPr>
                   <w:rFonts w:ascii="Arial" w:cs="Arial" w:eastAsia="Arial" w:hAnsi="Arial"/>
@@ -4540,7 +4540,7 @@
               <w:spacing w:after="10" w:before="0"/>
               <w:ind w:left="120"/>
             </w:pPr>
-            <w:hyperlink w:history="1" r:id="rIdywfxprgklicg2gclhpunq">
+            <w:hyperlink w:history="1" r:id="rIdu7mcjqykg74yhkbdezky9">
               <w:r>
                 <w:rPr>
                   <w:rFonts w:ascii="Arial" w:cs="Arial" w:eastAsia="Arial" w:hAnsi="Arial"/>
@@ -5052,7 +5052,7 @@
         </w:rPr>
         <w:t xml:space="preserve">© 2026 SeaVuria and ARES. Aligned with KICD objectives. Developed by SeaVuria; technical implementation by ARES (with AI assistance from Claude). Licensed under </w:t>
       </w:r>
-      <w:hyperlink w:history="1" r:id="rIdq8c_aejt-oxvf5lopvlky">
+      <w:hyperlink w:history="1" r:id="rId6jx4kmoad4co05txfkghw">
         <w:r>
           <w:rPr>
             <w:rFonts w:ascii="Arial" w:cs="Arial" w:eastAsia="Arial" w:hAnsi="Arial"/>
@@ -5073,7 +5073,7 @@
         </w:rPr>
         <w:t xml:space="preserve"> (</w:t>
       </w:r>
-      <w:hyperlink w:history="1" r:id="rIdwkcz3yvf7pn19sfi1uycd">
+      <w:hyperlink w:history="1" r:id="rIdtsgvc71g9xbv3u_9trewb">
         <w:r>
           <w:rPr>
             <w:rFonts w:ascii="Arial" w:cs="Arial" w:eastAsia="Arial" w:hAnsi="Arial"/>
@@ -6086,7 +6086,7 @@
             <w:pPr>
               <w:spacing w:after="20" w:before="0"/>
             </w:pPr>
-            <w:hyperlink w:history="1" r:id="rIdtcnnmb41kly0j995xnkjg">
+            <w:hyperlink w:history="1" r:id="rIdrwg1dqgwtckybyeuv_phk">
               <w:r>
                 <w:rPr>
                   <w:rFonts w:ascii="Arial" w:cs="Arial" w:eastAsia="Arial" w:hAnsi="Arial"/>
@@ -6135,7 +6135,7 @@
               <w:spacing w:after="10" w:before="0"/>
               <w:ind w:left="120"/>
             </w:pPr>
-            <w:hyperlink w:history="1" r:id="rIdadxjr6dkpcgeelag-xgwv">
+            <w:hyperlink w:history="1" r:id="rIddduiwdwkt2ojklmqhu5xt">
               <w:r>
                 <w:rPr>
                   <w:rFonts w:ascii="Arial" w:cs="Arial" w:eastAsia="Arial" w:hAnsi="Arial"/>
@@ -6180,7 +6180,7 @@
             <w:pPr>
               <w:spacing w:after="20" w:before="0"/>
             </w:pPr>
-            <w:hyperlink w:history="1" r:id="rId0accmanw2w09qekqtfab7">
+            <w:hyperlink w:history="1" r:id="rIder0tpl_uhiwukx2ss7e9f">
               <w:r>
                 <w:rPr>
                   <w:rFonts w:ascii="Arial" w:cs="Arial" w:eastAsia="Arial" w:hAnsi="Arial"/>
@@ -6229,7 +6229,7 @@
               <w:spacing w:after="10" w:before="0"/>
               <w:ind w:left="120"/>
             </w:pPr>
-            <w:hyperlink w:history="1" r:id="rIdg7yxnasrewm6-bskwzbya">
+            <w:hyperlink w:history="1" r:id="rIdgdk5pld4nt5d_zggbh_u1">
               <w:r>
                 <w:rPr>
                   <w:rFonts w:ascii="Arial" w:cs="Arial" w:eastAsia="Arial" w:hAnsi="Arial"/>
@@ -6424,7 +6424,7 @@
             <w:pPr>
               <w:spacing w:after="20" w:before="0"/>
             </w:pPr>
-            <w:hyperlink w:history="1" r:id="rIdosylulv_htrf3j_bwvank">
+            <w:hyperlink w:history="1" r:id="rIdvih28ialmcck4wfpy9sxc">
               <w:r>
                 <w:rPr>
                   <w:rFonts w:ascii="Arial" w:cs="Arial" w:eastAsia="Arial" w:hAnsi="Arial"/>
@@ -6473,7 +6473,7 @@
               <w:spacing w:after="10" w:before="0"/>
               <w:ind w:left="120"/>
             </w:pPr>
-            <w:hyperlink w:history="1" r:id="rIdeasjucg_sizlbfmsw8-_d">
+            <w:hyperlink w:history="1" r:id="rIdq6d0vguivdtvrreah1d8g">
               <w:r>
                 <w:rPr>
                   <w:rFonts w:ascii="Arial" w:cs="Arial" w:eastAsia="Arial" w:hAnsi="Arial"/>
@@ -6518,7 +6518,7 @@
             <w:pPr>
               <w:spacing w:after="20" w:before="0"/>
             </w:pPr>
-            <w:hyperlink w:history="1" r:id="rIdtpsjhtmhi3b7v7myssfnx">
+            <w:hyperlink w:history="1" r:id="rIdtfwufjyyp9fjz0w_hwrbc">
               <w:r>
                 <w:rPr>
                   <w:rFonts w:ascii="Arial" w:cs="Arial" w:eastAsia="Arial" w:hAnsi="Arial"/>
@@ -6567,7 +6567,7 @@
               <w:spacing w:after="10" w:before="0"/>
               <w:ind w:left="120"/>
             </w:pPr>
-            <w:hyperlink w:history="1" r:id="rIdgjwrefitaggwp6ihem2pn">
+            <w:hyperlink w:history="1" r:id="rIdyyek1ko8c6w4ab27onjl5">
               <w:r>
                 <w:rPr>
                   <w:rFonts w:ascii="Arial" w:cs="Arial" w:eastAsia="Arial" w:hAnsi="Arial"/>
@@ -6762,7 +6762,7 @@
             <w:pPr>
               <w:spacing w:after="20" w:before="0"/>
             </w:pPr>
-            <w:hyperlink w:history="1" r:id="rIdfa1znu6l-d2itlhryzkp7">
+            <w:hyperlink w:history="1" r:id="rIdxjdqrry0vdtcpldgutb8d">
               <w:r>
                 <w:rPr>
                   <w:rFonts w:ascii="Arial" w:cs="Arial" w:eastAsia="Arial" w:hAnsi="Arial"/>
@@ -6811,7 +6811,7 @@
               <w:spacing w:after="10" w:before="0"/>
               <w:ind w:left="120"/>
             </w:pPr>
-            <w:hyperlink w:history="1" r:id="rIdubyykfppnfodalqhlddpc">
+            <w:hyperlink w:history="1" r:id="rId9075bmivpjbuz2uz4os7y">
               <w:r>
                 <w:rPr>
                   <w:rFonts w:ascii="Arial" w:cs="Arial" w:eastAsia="Arial" w:hAnsi="Arial"/>
@@ -6856,7 +6856,7 @@
             <w:pPr>
               <w:spacing w:after="20" w:before="0"/>
             </w:pPr>
-            <w:hyperlink w:history="1" r:id="rIdo8fh5ppnbga2fv6gibkku">
+            <w:hyperlink w:history="1" r:id="rIdblyvqil0jh-snnsiwvssl">
               <w:r>
                 <w:rPr>
                   <w:rFonts w:ascii="Arial" w:cs="Arial" w:eastAsia="Arial" w:hAnsi="Arial"/>
@@ -6905,7 +6905,7 @@
               <w:spacing w:after="10" w:before="0"/>
               <w:ind w:left="120"/>
             </w:pPr>
-            <w:hyperlink w:history="1" r:id="rIdijc9tcozqijltli21rcmg">
+            <w:hyperlink w:history="1" r:id="rIdecvtiqwwto-sudsvfd1vk">
               <w:r>
                 <w:rPr>
                   <w:rFonts w:ascii="Arial" w:cs="Arial" w:eastAsia="Arial" w:hAnsi="Arial"/>
@@ -7100,7 +7100,7 @@
             <w:pPr>
               <w:spacing w:after="20" w:before="0"/>
             </w:pPr>
-            <w:hyperlink w:history="1" r:id="rIdbahcazzrlq3sr6leguek-">
+            <w:hyperlink w:history="1" r:id="rIdffblejc8ygtkoyt-gdpej">
               <w:r>
                 <w:rPr>
                   <w:rFonts w:ascii="Arial" w:cs="Arial" w:eastAsia="Arial" w:hAnsi="Arial"/>
@@ -7149,7 +7149,7 @@
               <w:spacing w:after="10" w:before="0"/>
               <w:ind w:left="120"/>
             </w:pPr>
-            <w:hyperlink w:history="1" r:id="rId7f2csab3zb2m5q_bkgeix">
+            <w:hyperlink w:history="1" r:id="rIdscitae8h35ubwjvr59wxv">
               <w:r>
                 <w:rPr>
                   <w:rFonts w:ascii="Arial" w:cs="Arial" w:eastAsia="Arial" w:hAnsi="Arial"/>
@@ -7194,7 +7194,7 @@
             <w:pPr>
               <w:spacing w:after="20" w:before="0"/>
             </w:pPr>
-            <w:hyperlink w:history="1" r:id="rIdl2oallknopob0szsvphvh">
+            <w:hyperlink w:history="1" r:id="rId_-vsnvx9dg8ghfcd9k-zo">
               <w:r>
                 <w:rPr>
                   <w:rFonts w:ascii="Arial" w:cs="Arial" w:eastAsia="Arial" w:hAnsi="Arial"/>
@@ -7243,7 +7243,7 @@
               <w:spacing w:after="10" w:before="0"/>
               <w:ind w:left="120"/>
             </w:pPr>
-            <w:hyperlink w:history="1" r:id="rIdmgdoocx1nf7tb536oepe7">
+            <w:hyperlink w:history="1" r:id="rIds0s8ec4frugou64znrqfr">
               <w:r>
                 <w:rPr>
                   <w:rFonts w:ascii="Arial" w:cs="Arial" w:eastAsia="Arial" w:hAnsi="Arial"/>
@@ -7438,7 +7438,7 @@
             <w:pPr>
               <w:spacing w:after="20" w:before="0"/>
             </w:pPr>
-            <w:hyperlink w:history="1" r:id="rId_rvftcekmzeav6emzmjam">
+            <w:hyperlink w:history="1" r:id="rIdb4yuwibp5ozcvdxxoq4j9">
               <w:r>
                 <w:rPr>
                   <w:rFonts w:ascii="Arial" w:cs="Arial" w:eastAsia="Arial" w:hAnsi="Arial"/>
@@ -7487,7 +7487,7 @@
               <w:spacing w:after="10" w:before="0"/>
               <w:ind w:left="120"/>
             </w:pPr>
-            <w:hyperlink w:history="1" r:id="rIdt8xsg9eqr4eh2az_dt6ve">
+            <w:hyperlink w:history="1" r:id="rIdafvrarajltgbqfzazpjaf">
               <w:r>
                 <w:rPr>
                   <w:rFonts w:ascii="Arial" w:cs="Arial" w:eastAsia="Arial" w:hAnsi="Arial"/>
@@ -7532,7 +7532,7 @@
             <w:pPr>
               <w:spacing w:after="20" w:before="0"/>
             </w:pPr>
-            <w:hyperlink w:history="1" r:id="rIdvdjlhpjs6-xblbvlsljjj">
+            <w:hyperlink w:history="1" r:id="rIdw1cyqydvaekzysq9dmlho">
               <w:r>
                 <w:rPr>
                   <w:rFonts w:ascii="Arial" w:cs="Arial" w:eastAsia="Arial" w:hAnsi="Arial"/>
@@ -7581,7 +7581,7 @@
               <w:spacing w:after="10" w:before="0"/>
               <w:ind w:left="120"/>
             </w:pPr>
-            <w:hyperlink w:history="1" r:id="rIdtryz0oobmzxugvfv8siay">
+            <w:hyperlink w:history="1" r:id="rIdlzhdnxduisy4-gcfpva7s">
               <w:r>
                 <w:rPr>
                   <w:rFonts w:ascii="Arial" w:cs="Arial" w:eastAsia="Arial" w:hAnsi="Arial"/>
@@ -8093,7 +8093,7 @@
         </w:rPr>
         <w:t xml:space="preserve">© 2026 SeaVuria and ARES. Aligned with KICD objectives. Developed by SeaVuria; technical implementation by ARES (with AI assistance from Claude). Licensed under </w:t>
       </w:r>
-      <w:hyperlink w:history="1" r:id="rIdappepf_-_wr7nu3pik8cv">
+      <w:hyperlink w:history="1" r:id="rId55ex5kuk57ojrk4ndatmt">
         <w:r>
           <w:rPr>
             <w:rFonts w:ascii="Arial" w:cs="Arial" w:eastAsia="Arial" w:hAnsi="Arial"/>
@@ -8114,7 +8114,7 @@
         </w:rPr>
         <w:t xml:space="preserve"> (</w:t>
       </w:r>
-      <w:hyperlink w:history="1" r:id="rIdlsbkj3ghwnbmymgusasru">
+      <w:hyperlink w:history="1" r:id="rIdpbxsgknmkmsb4_yfpppzt">
         <w:r>
           <w:rPr>
             <w:rFonts w:ascii="Arial" w:cs="Arial" w:eastAsia="Arial" w:hAnsi="Arial"/>
@@ -9127,7 +9127,7 @@
             <w:pPr>
               <w:spacing w:after="20" w:before="0"/>
             </w:pPr>
-            <w:hyperlink w:history="1" r:id="rIdko4kdthar7c9t_wlell62">
+            <w:hyperlink w:history="1" r:id="rIdddeqjhixmmkgfu3bb_6bv">
               <w:r>
                 <w:rPr>
                   <w:rFonts w:ascii="Arial" w:cs="Arial" w:eastAsia="Arial" w:hAnsi="Arial"/>
@@ -9176,7 +9176,7 @@
               <w:spacing w:after="10" w:before="0"/>
               <w:ind w:left="120"/>
             </w:pPr>
-            <w:hyperlink w:history="1" r:id="rIdrdr1s6q14xcxk0g_fva2y">
+            <w:hyperlink w:history="1" r:id="rId1pefkv9lt8n5xfvkrnjzj">
               <w:r>
                 <w:rPr>
                   <w:rFonts w:ascii="Arial" w:cs="Arial" w:eastAsia="Arial" w:hAnsi="Arial"/>
@@ -9238,7 +9238,7 @@
               <w:spacing w:after="10" w:before="0"/>
               <w:ind w:left="120"/>
             </w:pPr>
-            <w:hyperlink w:history="1" r:id="rIdqqdpu8xewsmvkwfdd-hug">
+            <w:hyperlink w:history="1" r:id="rIdednhkeyziwr_z9ykppexw">
               <w:r>
                 <w:rPr>
                   <w:rFonts w:ascii="Arial" w:cs="Arial" w:eastAsia="Arial" w:hAnsi="Arial"/>
@@ -9448,7 +9448,7 @@
             <w:pPr>
               <w:spacing w:after="20" w:before="0"/>
             </w:pPr>
-            <w:hyperlink w:history="1" r:id="rIdtfxx4uofos2vb3o5q4fdf">
+            <w:hyperlink w:history="1" r:id="rIduqzvjfq3d_809tj6jjutx">
               <w:r>
                 <w:rPr>
                   <w:rFonts w:ascii="Arial" w:cs="Arial" w:eastAsia="Arial" w:hAnsi="Arial"/>
@@ -9497,7 +9497,7 @@
               <w:spacing w:after="10" w:before="0"/>
               <w:ind w:left="120"/>
             </w:pPr>
-            <w:hyperlink w:history="1" r:id="rIdnnspditbbr8t95nyb1-ix">
+            <w:hyperlink w:history="1" r:id="rId94u0j3hdgouazj3skm8pi">
               <w:r>
                 <w:rPr>
                   <w:rFonts w:ascii="Arial" w:cs="Arial" w:eastAsia="Arial" w:hAnsi="Arial"/>
@@ -9559,7 +9559,7 @@
               <w:spacing w:after="10" w:before="0"/>
               <w:ind w:left="120"/>
             </w:pPr>
-            <w:hyperlink w:history="1" r:id="rIdhhdn1fdmkrodozdhapkqm">
+            <w:hyperlink w:history="1" r:id="rId2xys5xp9hgeoaie7coqkp">
               <w:r>
                 <w:rPr>
                   <w:rFonts w:ascii="Arial" w:cs="Arial" w:eastAsia="Arial" w:hAnsi="Arial"/>
@@ -9769,7 +9769,7 @@
             <w:pPr>
               <w:spacing w:after="20" w:before="0"/>
             </w:pPr>
-            <w:hyperlink w:history="1" r:id="rIdfdxq-zaatyiptjl3mdi49">
+            <w:hyperlink w:history="1" r:id="rIdayf3n75kpksw3s78sj8by">
               <w:r>
                 <w:rPr>
                   <w:rFonts w:ascii="Arial" w:cs="Arial" w:eastAsia="Arial" w:hAnsi="Arial"/>
@@ -9818,7 +9818,7 @@
               <w:spacing w:after="10" w:before="0"/>
               <w:ind w:left="120"/>
             </w:pPr>
-            <w:hyperlink w:history="1" r:id="rIdwknhydfwwfssdb0bilixu">
+            <w:hyperlink w:history="1" r:id="rIdidqf-wrq0mks9gq7srgsa">
               <w:r>
                 <w:rPr>
                   <w:rFonts w:ascii="Arial" w:cs="Arial" w:eastAsia="Arial" w:hAnsi="Arial"/>
@@ -9880,7 +9880,7 @@
               <w:spacing w:after="10" w:before="0"/>
               <w:ind w:left="120"/>
             </w:pPr>
-            <w:hyperlink w:history="1" r:id="rIdppwyoxedrmqqcys25pldc">
+            <w:hyperlink w:history="1" r:id="rId2vc0dnfnsy7cba25pxouk">
               <w:r>
                 <w:rPr>
                   <w:rFonts w:ascii="Arial" w:cs="Arial" w:eastAsia="Arial" w:hAnsi="Arial"/>
@@ -10090,7 +10090,7 @@
             <w:pPr>
               <w:spacing w:after="20" w:before="0"/>
             </w:pPr>
-            <w:hyperlink w:history="1" r:id="rIdx2sfqylpgh4u8ob5zefb_">
+            <w:hyperlink w:history="1" r:id="rIdfefq4uhdayh_fuguhsbto">
               <w:r>
                 <w:rPr>
                   <w:rFonts w:ascii="Arial" w:cs="Arial" w:eastAsia="Arial" w:hAnsi="Arial"/>
@@ -10139,7 +10139,7 @@
               <w:spacing w:after="10" w:before="0"/>
               <w:ind w:left="120"/>
             </w:pPr>
-            <w:hyperlink w:history="1" r:id="rId8r80fe27riek53tm948ev">
+            <w:hyperlink w:history="1" r:id="rIdr9d9syhko8nakfrjladz4">
               <w:r>
                 <w:rPr>
                   <w:rFonts w:ascii="Arial" w:cs="Arial" w:eastAsia="Arial" w:hAnsi="Arial"/>
@@ -10201,7 +10201,7 @@
               <w:spacing w:after="10" w:before="0"/>
               <w:ind w:left="120"/>
             </w:pPr>
-            <w:hyperlink w:history="1" r:id="rIdg4qxscv9emad0yn4x_fmv">
+            <w:hyperlink w:history="1" r:id="rIdt04pnf2ac2bo-johozpq_">
               <w:r>
                 <w:rPr>
                   <w:rFonts w:ascii="Arial" w:cs="Arial" w:eastAsia="Arial" w:hAnsi="Arial"/>
@@ -10411,7 +10411,7 @@
             <w:pPr>
               <w:spacing w:after="20" w:before="0"/>
             </w:pPr>
-            <w:hyperlink w:history="1" r:id="rIdfcfnflrjhtast71y4u_w2">
+            <w:hyperlink w:history="1" r:id="rIdspaindnbcopck4hqxawla">
               <w:r>
                 <w:rPr>
                   <w:rFonts w:ascii="Arial" w:cs="Arial" w:eastAsia="Arial" w:hAnsi="Arial"/>
@@ -10460,7 +10460,7 @@
               <w:spacing w:after="10" w:before="0"/>
               <w:ind w:left="120"/>
             </w:pPr>
-            <w:hyperlink w:history="1" r:id="rIdqexgciycasg4wfpvwmh4d">
+            <w:hyperlink w:history="1" r:id="rIdubwtpzo_icgz8qyunwljr">
               <w:r>
                 <w:rPr>
                   <w:rFonts w:ascii="Arial" w:cs="Arial" w:eastAsia="Arial" w:hAnsi="Arial"/>
@@ -10522,7 +10522,7 @@
               <w:spacing w:after="10" w:before="0"/>
               <w:ind w:left="120"/>
             </w:pPr>
-            <w:hyperlink w:history="1" r:id="rIdpfdql0ahoidqcwt7uu95q">
+            <w:hyperlink w:history="1" r:id="rIdu1sqtr3qiunfni2d6jhyc">
               <w:r>
                 <w:rPr>
                   <w:rFonts w:ascii="Arial" w:cs="Arial" w:eastAsia="Arial" w:hAnsi="Arial"/>
@@ -11049,7 +11049,7 @@
         </w:rPr>
         <w:t xml:space="preserve">© 2026 SeaVuria and ARES. Aligned with KICD objectives. Developed by SeaVuria; technical implementation by ARES (with AI assistance from Claude). Licensed under </w:t>
       </w:r>
-      <w:hyperlink w:history="1" r:id="rIdi_5tzvtc91utifjpyk-oh">
+      <w:hyperlink w:history="1" r:id="rIdnh-xzeurzxz8fxkejr3qz">
         <w:r>
           <w:rPr>
             <w:rFonts w:ascii="Arial" w:cs="Arial" w:eastAsia="Arial" w:hAnsi="Arial"/>
@@ -11070,7 +11070,7 @@
         </w:rPr>
         <w:t xml:space="preserve"> (</w:t>
       </w:r>
-      <w:hyperlink w:history="1" r:id="rIdjqvpjmzf8n5t7gphskhse">
+      <w:hyperlink w:history="1" r:id="rIdtzw8boeyoz0ueehsawj1h">
         <w:r>
           <w:rPr>
             <w:rFonts w:ascii="Arial" w:cs="Arial" w:eastAsia="Arial" w:hAnsi="Arial"/>
@@ -12083,7 +12083,7 @@
             <w:pPr>
               <w:spacing w:after="20" w:before="0"/>
             </w:pPr>
-            <w:hyperlink w:history="1" r:id="rId7oimmq6cuuv9ph-edctan">
+            <w:hyperlink w:history="1" r:id="rIdltagyata5xlmg2yjf4dzq">
               <w:r>
                 <w:rPr>
                   <w:rFonts w:ascii="Arial" w:cs="Arial" w:eastAsia="Arial" w:hAnsi="Arial"/>
@@ -12132,7 +12132,7 @@
               <w:spacing w:after="10" w:before="0"/>
               <w:ind w:left="120"/>
             </w:pPr>
-            <w:hyperlink w:history="1" r:id="rId9pwc66l8ihfxyxogrhhz9">
+            <w:hyperlink w:history="1" r:id="rIdfedmi1vgmzitatvnpnemo">
               <w:r>
                 <w:rPr>
                   <w:rFonts w:ascii="Arial" w:cs="Arial" w:eastAsia="Arial" w:hAnsi="Arial"/>
@@ -12194,7 +12194,7 @@
               <w:spacing w:after="10" w:before="0"/>
               <w:ind w:left="120"/>
             </w:pPr>
-            <w:hyperlink w:history="1" r:id="rIdkgpt3ncqvlmlbh2ubkaan">
+            <w:hyperlink w:history="1" r:id="rIdowaaso9k1tbshhyajo8tj">
               <w:r>
                 <w:rPr>
                   <w:rFonts w:ascii="Arial" w:cs="Arial" w:eastAsia="Arial" w:hAnsi="Arial"/>
@@ -12404,7 +12404,7 @@
             <w:pPr>
               <w:spacing w:after="20" w:before="0"/>
             </w:pPr>
-            <w:hyperlink w:history="1" r:id="rIduibyrrxzmbicnrd0_lnhk">
+            <w:hyperlink w:history="1" r:id="rIdusy1d8xla4bdprm3u3mxr">
               <w:r>
                 <w:rPr>
                   <w:rFonts w:ascii="Arial" w:cs="Arial" w:eastAsia="Arial" w:hAnsi="Arial"/>
@@ -12453,7 +12453,7 @@
               <w:spacing w:after="10" w:before="0"/>
               <w:ind w:left="120"/>
             </w:pPr>
-            <w:hyperlink w:history="1" r:id="rIda4llxb0twgickwmncbvd9">
+            <w:hyperlink w:history="1" r:id="rId_jzwlug-shzdjkg2i1yvx">
               <w:r>
                 <w:rPr>
                   <w:rFonts w:ascii="Arial" w:cs="Arial" w:eastAsia="Arial" w:hAnsi="Arial"/>
@@ -12515,7 +12515,7 @@
               <w:spacing w:after="10" w:before="0"/>
               <w:ind w:left="120"/>
             </w:pPr>
-            <w:hyperlink w:history="1" r:id="rIdgb7ajvtmgoase7li2zmi_">
+            <w:hyperlink w:history="1" r:id="rId3emsedbfhssw1rgkaztc6">
               <w:r>
                 <w:rPr>
                   <w:rFonts w:ascii="Arial" w:cs="Arial" w:eastAsia="Arial" w:hAnsi="Arial"/>
@@ -12725,7 +12725,7 @@
             <w:pPr>
               <w:spacing w:after="20" w:before="0"/>
             </w:pPr>
-            <w:hyperlink w:history="1" r:id="rIdmithyjq4m6p9hqjtnlejy">
+            <w:hyperlink w:history="1" r:id="rIdnbmx-exjw0mpqruwoflmy">
               <w:r>
                 <w:rPr>
                   <w:rFonts w:ascii="Arial" w:cs="Arial" w:eastAsia="Arial" w:hAnsi="Arial"/>
@@ -12774,7 +12774,7 @@
               <w:spacing w:after="10" w:before="0"/>
               <w:ind w:left="120"/>
             </w:pPr>
-            <w:hyperlink w:history="1" r:id="rIdtfsf_fjpj7b2mm_3eauwr">
+            <w:hyperlink w:history="1" r:id="rIdwmm_pk2u14a_utum4yzms">
               <w:r>
                 <w:rPr>
                   <w:rFonts w:ascii="Arial" w:cs="Arial" w:eastAsia="Arial" w:hAnsi="Arial"/>
@@ -12836,7 +12836,7 @@
               <w:spacing w:after="10" w:before="0"/>
               <w:ind w:left="120"/>
             </w:pPr>
-            <w:hyperlink w:history="1" r:id="rId4qektb5fswqb8-igbus6v">
+            <w:hyperlink w:history="1" r:id="rIdd_ow0stydfrcji5pke5mh">
               <w:r>
                 <w:rPr>
                   <w:rFonts w:ascii="Arial" w:cs="Arial" w:eastAsia="Arial" w:hAnsi="Arial"/>
@@ -13046,7 +13046,7 @@
             <w:pPr>
               <w:spacing w:after="20" w:before="0"/>
             </w:pPr>
-            <w:hyperlink w:history="1" r:id="rIdz0mxqasvdfc3ng0-h25zv">
+            <w:hyperlink w:history="1" r:id="rIdztuy2d1sl_ff1sky1jpsp">
               <w:r>
                 <w:rPr>
                   <w:rFonts w:ascii="Arial" w:cs="Arial" w:eastAsia="Arial" w:hAnsi="Arial"/>
@@ -13095,7 +13095,7 @@
               <w:spacing w:after="10" w:before="0"/>
               <w:ind w:left="120"/>
             </w:pPr>
-            <w:hyperlink w:history="1" r:id="rIdweoqzk_katonbgdrjd6pk">
+            <w:hyperlink w:history="1" r:id="rIdqi-slvylgcrgjlkiqxcud">
               <w:r>
                 <w:rPr>
                   <w:rFonts w:ascii="Arial" w:cs="Arial" w:eastAsia="Arial" w:hAnsi="Arial"/>
@@ -13157,7 +13157,7 @@
               <w:spacing w:after="10" w:before="0"/>
               <w:ind w:left="120"/>
             </w:pPr>
-            <w:hyperlink w:history="1" r:id="rIdqbdrqwk8mbma59-vlejrm">
+            <w:hyperlink w:history="1" r:id="rId3ixt5leziy7fzglwtn0j1">
               <w:r>
                 <w:rPr>
                   <w:rFonts w:ascii="Arial" w:cs="Arial" w:eastAsia="Arial" w:hAnsi="Arial"/>
@@ -13367,7 +13367,7 @@
             <w:pPr>
               <w:spacing w:after="20" w:before="0"/>
             </w:pPr>
-            <w:hyperlink w:history="1" r:id="rId9-ejldpohcic65rstenye">
+            <w:hyperlink w:history="1" r:id="rId5qokyrxfzxtuq3th4houj">
               <w:r>
                 <w:rPr>
                   <w:rFonts w:ascii="Arial" w:cs="Arial" w:eastAsia="Arial" w:hAnsi="Arial"/>
@@ -13416,7 +13416,7 @@
               <w:spacing w:after="10" w:before="0"/>
               <w:ind w:left="120"/>
             </w:pPr>
-            <w:hyperlink w:history="1" r:id="rIdk9gsjsx_noqdmmo57lgkp">
+            <w:hyperlink w:history="1" r:id="rIdk4r6db4rhobgsmb7hdfb-">
               <w:r>
                 <w:rPr>
                   <w:rFonts w:ascii="Arial" w:cs="Arial" w:eastAsia="Arial" w:hAnsi="Arial"/>
@@ -13478,7 +13478,7 @@
               <w:spacing w:after="10" w:before="0"/>
               <w:ind w:left="120"/>
             </w:pPr>
-            <w:hyperlink w:history="1" r:id="rIdok5b5czemprofxkh1leiz">
+            <w:hyperlink w:history="1" r:id="rIdcq93ci3tocoghkso2hg6p">
               <w:r>
                 <w:rPr>
                   <w:rFonts w:ascii="Arial" w:cs="Arial" w:eastAsia="Arial" w:hAnsi="Arial"/>
@@ -14005,7 +14005,7 @@
         </w:rPr>
         <w:t xml:space="preserve">© 2026 SeaVuria and ARES. Aligned with KICD objectives. Developed by SeaVuria; technical implementation by ARES (with AI assistance from Claude). Licensed under </w:t>
       </w:r>
-      <w:hyperlink w:history="1" r:id="rIdoboa9vhd4yo2mldhmowsw">
+      <w:hyperlink w:history="1" r:id="rId5jv1dm2rrh94nwzyox6ap">
         <w:r>
           <w:rPr>
             <w:rFonts w:ascii="Arial" w:cs="Arial" w:eastAsia="Arial" w:hAnsi="Arial"/>
@@ -14026,7 +14026,7 @@
         </w:rPr>
         <w:t xml:space="preserve"> (</w:t>
       </w:r>
-      <w:hyperlink w:history="1" r:id="rIdiosqtutmuultt_c16soj1">
+      <w:hyperlink w:history="1" r:id="rIdfsrxk92fxlbhpvnhikkor">
         <w:r>
           <w:rPr>
             <w:rFonts w:ascii="Arial" w:cs="Arial" w:eastAsia="Arial" w:hAnsi="Arial"/>
@@ -15056,7 +15056,7 @@
               <w:spacing w:after="10" w:before="0"/>
               <w:ind w:left="120"/>
             </w:pPr>
-            <w:hyperlink w:history="1" r:id="rId5gw550gavfemab0cqzvfm">
+            <w:hyperlink w:history="1" r:id="rIdbxou1b4nbyggxjdpacppw">
               <w:r>
                 <w:rPr>
                   <w:rFonts w:ascii="Arial" w:cs="Arial" w:eastAsia="Arial" w:hAnsi="Arial"/>
@@ -15133,7 +15133,7 @@
               <w:spacing w:after="10" w:before="0"/>
               <w:ind w:left="120"/>
             </w:pPr>
-            <w:hyperlink w:history="1" r:id="rIdw193jt5us-y69rvpwuww_">
+            <w:hyperlink w:history="1" r:id="rId8l2tf0eel-r9pwa1yvjry">
               <w:r>
                 <w:rPr>
                   <w:rFonts w:ascii="Arial" w:cs="Arial" w:eastAsia="Arial" w:hAnsi="Arial"/>
@@ -15360,7 +15360,7 @@
               <w:spacing w:after="10" w:before="0"/>
               <w:ind w:left="120"/>
             </w:pPr>
-            <w:hyperlink w:history="1" r:id="rIdvgkot44zxx9m0mncnu_ix">
+            <w:hyperlink w:history="1" r:id="rIdwnrksfby2r-yvfiyvzu-c">
               <w:r>
                 <w:rPr>
                   <w:rFonts w:ascii="Arial" w:cs="Arial" w:eastAsia="Arial" w:hAnsi="Arial"/>
@@ -15437,7 +15437,7 @@
               <w:spacing w:after="10" w:before="0"/>
               <w:ind w:left="120"/>
             </w:pPr>
-            <w:hyperlink w:history="1" r:id="rIdxj7iato5aa-8dwkglwt1t">
+            <w:hyperlink w:history="1" r:id="rId16z3japsmmeagnhpmqlex">
               <w:r>
                 <w:rPr>
                   <w:rFonts w:ascii="Arial" w:cs="Arial" w:eastAsia="Arial" w:hAnsi="Arial"/>
@@ -15664,7 +15664,7 @@
               <w:spacing w:after="10" w:before="0"/>
               <w:ind w:left="120"/>
             </w:pPr>
-            <w:hyperlink w:history="1" r:id="rIddkcpeaissl3jej0mjhvew">
+            <w:hyperlink w:history="1" r:id="rIdjvo2aqihsywgv1auvgpwd">
               <w:r>
                 <w:rPr>
                   <w:rFonts w:ascii="Arial" w:cs="Arial" w:eastAsia="Arial" w:hAnsi="Arial"/>
@@ -15741,7 +15741,7 @@
               <w:spacing w:after="10" w:before="0"/>
               <w:ind w:left="120"/>
             </w:pPr>
-            <w:hyperlink w:history="1" r:id="rIdqfxlkin6gdtphbenzrzru">
+            <w:hyperlink w:history="1" r:id="rIdcbqf4xyfzacblkyfnstp_">
               <w:r>
                 <w:rPr>
                   <w:rFonts w:ascii="Arial" w:cs="Arial" w:eastAsia="Arial" w:hAnsi="Arial"/>
@@ -15968,7 +15968,7 @@
               <w:spacing w:after="10" w:before="0"/>
               <w:ind w:left="120"/>
             </w:pPr>
-            <w:hyperlink w:history="1" r:id="rIdc8qtx-loijqey_k_ppoyn">
+            <w:hyperlink w:history="1" r:id="rIdsl59zu4m56dt50vhlawvy">
               <w:r>
                 <w:rPr>
                   <w:rFonts w:ascii="Arial" w:cs="Arial" w:eastAsia="Arial" w:hAnsi="Arial"/>
@@ -16045,7 +16045,7 @@
               <w:spacing w:after="10" w:before="0"/>
               <w:ind w:left="120"/>
             </w:pPr>
-            <w:hyperlink w:history="1" r:id="rIdhqjk26yjitxdeqw09zadp">
+            <w:hyperlink w:history="1" r:id="rIdaztsx3a51lq-g54hhyn15">
               <w:r>
                 <w:rPr>
                   <w:rFonts w:ascii="Arial" w:cs="Arial" w:eastAsia="Arial" w:hAnsi="Arial"/>
@@ -16272,7 +16272,7 @@
               <w:spacing w:after="10" w:before="0"/>
               <w:ind w:left="120"/>
             </w:pPr>
-            <w:hyperlink w:history="1" r:id="rIdwgf9lceelevq7r2b6defx">
+            <w:hyperlink w:history="1" r:id="rIdjnzolz9sl9yrjfykb_zna">
               <w:r>
                 <w:rPr>
                   <w:rFonts w:ascii="Arial" w:cs="Arial" w:eastAsia="Arial" w:hAnsi="Arial"/>
@@ -16349,7 +16349,7 @@
               <w:spacing w:after="10" w:before="0"/>
               <w:ind w:left="120"/>
             </w:pPr>
-            <w:hyperlink w:history="1" r:id="rIdz8yz3cnykafqcmqhb0aqy">
+            <w:hyperlink w:history="1" r:id="rIdhveqmoe8nqbjfaetsllgl">
               <w:r>
                 <w:rPr>
                   <w:rFonts w:ascii="Arial" w:cs="Arial" w:eastAsia="Arial" w:hAnsi="Arial"/>
@@ -16876,7 +16876,7 @@
         </w:rPr>
         <w:t xml:space="preserve">© 2026 SeaVuria and ARES. Aligned with KICD objectives. Developed by SeaVuria; technical implementation by ARES (with AI assistance from Claude). Licensed under </w:t>
       </w:r>
-      <w:hyperlink w:history="1" r:id="rIdp4vslmscu2waaibe3hioc">
+      <w:hyperlink w:history="1" r:id="rIdsy3mctwfxolfgyl9-zmxl">
         <w:r>
           <w:rPr>
             <w:rFonts w:ascii="Arial" w:cs="Arial" w:eastAsia="Arial" w:hAnsi="Arial"/>
@@ -16897,7 +16897,7 @@
         </w:rPr>
         <w:t xml:space="preserve"> (</w:t>
       </w:r>
-      <w:hyperlink w:history="1" r:id="rIda5-noltgh6b0oeggiiwve">
+      <w:hyperlink w:history="1" r:id="rIdbpruje4ishj6wdgv7ntd3">
         <w:r>
           <w:rPr>
             <w:rFonts w:ascii="Arial" w:cs="Arial" w:eastAsia="Arial" w:hAnsi="Arial"/>
@@ -17927,7 +17927,7 @@
               <w:spacing w:after="10" w:before="0"/>
               <w:ind w:left="120"/>
             </w:pPr>
-            <w:hyperlink w:history="1" r:id="rId2uxgyr0fsgl07cmq0ht21">
+            <w:hyperlink w:history="1" r:id="rIdtlbyraswhxidqlu0nud8q">
               <w:r>
                 <w:rPr>
                   <w:rFonts w:ascii="Arial" w:cs="Arial" w:eastAsia="Arial" w:hAnsi="Arial"/>
@@ -18004,7 +18004,7 @@
               <w:spacing w:after="10" w:before="0"/>
               <w:ind w:left="120"/>
             </w:pPr>
-            <w:hyperlink w:history="1" r:id="rIdeckimipxgdkyz5vikuyq2">
+            <w:hyperlink w:history="1" r:id="rId5gzi3jxt3dwwxaxgbeoc9">
               <w:r>
                 <w:rPr>
                   <w:rFonts w:ascii="Arial" w:cs="Arial" w:eastAsia="Arial" w:hAnsi="Arial"/>
@@ -18231,7 +18231,7 @@
               <w:spacing w:after="10" w:before="0"/>
               <w:ind w:left="120"/>
             </w:pPr>
-            <w:hyperlink w:history="1" r:id="rIdzo35zzryxqk-0v7wqavoe">
+            <w:hyperlink w:history="1" r:id="rIdbz0xvmj_9yahghjzpwyiq">
               <w:r>
                 <w:rPr>
                   <w:rFonts w:ascii="Arial" w:cs="Arial" w:eastAsia="Arial" w:hAnsi="Arial"/>
@@ -18308,7 +18308,7 @@
               <w:spacing w:after="10" w:before="0"/>
               <w:ind w:left="120"/>
             </w:pPr>
-            <w:hyperlink w:history="1" r:id="rIdnupowp_b9pymzybbdoqxm">
+            <w:hyperlink w:history="1" r:id="rId8ustso1loag-ihu8-ijpc">
               <w:r>
                 <w:rPr>
                   <w:rFonts w:ascii="Arial" w:cs="Arial" w:eastAsia="Arial" w:hAnsi="Arial"/>
@@ -18535,7 +18535,7 @@
               <w:spacing w:after="10" w:before="0"/>
               <w:ind w:left="120"/>
             </w:pPr>
-            <w:hyperlink w:history="1" r:id="rIddhtl_mywnxznmhhiez9wo">
+            <w:hyperlink w:history="1" r:id="rIdrhr3brlfcnr2jpoqcazqf">
               <w:r>
                 <w:rPr>
                   <w:rFonts w:ascii="Arial" w:cs="Arial" w:eastAsia="Arial" w:hAnsi="Arial"/>
@@ -18612,7 +18612,7 @@
               <w:spacing w:after="10" w:before="0"/>
               <w:ind w:left="120"/>
             </w:pPr>
-            <w:hyperlink w:history="1" r:id="rIda-845udublzuduhc91spu">
+            <w:hyperlink w:history="1" r:id="rIdzzunoiqkg8pi-s3tcdepp">
               <w:r>
                 <w:rPr>
                   <w:rFonts w:ascii="Arial" w:cs="Arial" w:eastAsia="Arial" w:hAnsi="Arial"/>
@@ -18839,7 +18839,7 @@
               <w:spacing w:after="10" w:before="0"/>
               <w:ind w:left="120"/>
             </w:pPr>
-            <w:hyperlink w:history="1" r:id="rIdog00xmdqalflqwsyaxk2a">
+            <w:hyperlink w:history="1" r:id="rId3uddmcam8pbudspqjscrv">
               <w:r>
                 <w:rPr>
                   <w:rFonts w:ascii="Arial" w:cs="Arial" w:eastAsia="Arial" w:hAnsi="Arial"/>
@@ -18916,7 +18916,7 @@
               <w:spacing w:after="10" w:before="0"/>
               <w:ind w:left="120"/>
             </w:pPr>
-            <w:hyperlink w:history="1" r:id="rIdhvhr5fedzijuedf8clqc1">
+            <w:hyperlink w:history="1" r:id="rIdla0rszjmh74jtqjfmai_h">
               <w:r>
                 <w:rPr>
                   <w:rFonts w:ascii="Arial" w:cs="Arial" w:eastAsia="Arial" w:hAnsi="Arial"/>
@@ -19143,7 +19143,7 @@
               <w:spacing w:after="10" w:before="0"/>
               <w:ind w:left="120"/>
             </w:pPr>
-            <w:hyperlink w:history="1" r:id="rIdys5rcnwp4h5f-e6flcyf8">
+            <w:hyperlink w:history="1" r:id="rIduq-rqnkocbpwx8qvlqfmn">
               <w:r>
                 <w:rPr>
                   <w:rFonts w:ascii="Arial" w:cs="Arial" w:eastAsia="Arial" w:hAnsi="Arial"/>
@@ -19220,7 +19220,7 @@
               <w:spacing w:after="10" w:before="0"/>
               <w:ind w:left="120"/>
             </w:pPr>
-            <w:hyperlink w:history="1" r:id="rIdrew8iwh6pltipxpbbry91">
+            <w:hyperlink w:history="1" r:id="rIdya3rgb8huonf_xrjakejr">
               <w:r>
                 <w:rPr>
                   <w:rFonts w:ascii="Arial" w:cs="Arial" w:eastAsia="Arial" w:hAnsi="Arial"/>
@@ -19747,7 +19747,7 @@
         </w:rPr>
         <w:t xml:space="preserve">© 2026 SeaVuria and ARES. Aligned with KICD objectives. Developed by SeaVuria; technical implementation by ARES (with AI assistance from Claude). Licensed under </w:t>
       </w:r>
-      <w:hyperlink w:history="1" r:id="rIdwqwjezubw8jxiwhich9ik">
+      <w:hyperlink w:history="1" r:id="rIdygb6ebvnlgovmnjcl-hkw">
         <w:r>
           <w:rPr>
             <w:rFonts w:ascii="Arial" w:cs="Arial" w:eastAsia="Arial" w:hAnsi="Arial"/>
@@ -19768,7 +19768,7 @@
         </w:rPr>
         <w:t xml:space="preserve"> (</w:t>
       </w:r>
-      <w:hyperlink w:history="1" r:id="rIduh-7bhauvekksgitmdo1c">
+      <w:hyperlink w:history="1" r:id="rId-dcmzeeqppwekfhi5rk1f">
         <w:r>
           <w:rPr>
             <w:rFonts w:ascii="Arial" w:cs="Arial" w:eastAsia="Arial" w:hAnsi="Arial"/>
@@ -20781,7 +20781,7 @@
             <w:pPr>
               <w:spacing w:after="20" w:before="0"/>
             </w:pPr>
-            <w:hyperlink w:history="1" r:id="rId4vkjgg9lmm0pbddgxfzn1">
+            <w:hyperlink w:history="1" r:id="rIdjdjf0fyvfmmho6adgxc3k">
               <w:r>
                 <w:rPr>
                   <w:rFonts w:ascii="Arial" w:cs="Arial" w:eastAsia="Arial" w:hAnsi="Arial"/>
@@ -20814,7 +20814,7 @@
               <w:spacing w:after="10" w:before="0"/>
               <w:ind w:left="120"/>
             </w:pPr>
-            <w:hyperlink w:history="1" r:id="rIdga3rga4pcugdmf2iff-fz">
+            <w:hyperlink w:history="1" r:id="rId4ljtbgusy9yi7sbxnekn4">
               <w:r>
                 <w:rPr>
                   <w:rFonts w:ascii="Arial" w:cs="Arial" w:eastAsia="Arial" w:hAnsi="Arial"/>
@@ -20859,7 +20859,7 @@
             <w:pPr>
               <w:spacing w:after="20" w:before="0"/>
             </w:pPr>
-            <w:hyperlink w:history="1" r:id="rIdeps5wobmorz3v_x-djngn">
+            <w:hyperlink w:history="1" r:id="rIdo7f40itgasehjc97j6izg">
               <w:r>
                 <w:rPr>
                   <w:rFonts w:ascii="Arial" w:cs="Arial" w:eastAsia="Arial" w:hAnsi="Arial"/>
@@ -20892,7 +20892,7 @@
               <w:spacing w:after="10" w:before="0"/>
               <w:ind w:left="120"/>
             </w:pPr>
-            <w:hyperlink w:history="1" r:id="rId4k2fu3grp1e5x85zph9hi">
+            <w:hyperlink w:history="1" r:id="rIdmk-ytpbsxc1ypncpvk9dw">
               <w:r>
                 <w:rPr>
                   <w:rFonts w:ascii="Arial" w:cs="Arial" w:eastAsia="Arial" w:hAnsi="Arial"/>
@@ -21087,7 +21087,7 @@
             <w:pPr>
               <w:spacing w:after="20" w:before="0"/>
             </w:pPr>
-            <w:hyperlink w:history="1" r:id="rIdbkcsbcvmyx6njafvzgjds">
+            <w:hyperlink w:history="1" r:id="rIdpw_gzlgybe7-9zjygq-zp">
               <w:r>
                 <w:rPr>
                   <w:rFonts w:ascii="Arial" w:cs="Arial" w:eastAsia="Arial" w:hAnsi="Arial"/>
@@ -21120,7 +21120,7 @@
               <w:spacing w:after="10" w:before="0"/>
               <w:ind w:left="120"/>
             </w:pPr>
-            <w:hyperlink w:history="1" r:id="rId9tpmw0ihe3vyvlwfigb43">
+            <w:hyperlink w:history="1" r:id="rIdl6kilecj064ompsiwln6i">
               <w:r>
                 <w:rPr>
                   <w:rFonts w:ascii="Arial" w:cs="Arial" w:eastAsia="Arial" w:hAnsi="Arial"/>
@@ -21165,7 +21165,7 @@
             <w:pPr>
               <w:spacing w:after="20" w:before="0"/>
             </w:pPr>
-            <w:hyperlink w:history="1" r:id="rIdggqbadslnbnum1wy47lbp">
+            <w:hyperlink w:history="1" r:id="rIdqmhrysbdwvzw9a0q0pvq_">
               <w:r>
                 <w:rPr>
                   <w:rFonts w:ascii="Arial" w:cs="Arial" w:eastAsia="Arial" w:hAnsi="Arial"/>
@@ -21198,7 +21198,7 @@
               <w:spacing w:after="10" w:before="0"/>
               <w:ind w:left="120"/>
             </w:pPr>
-            <w:hyperlink w:history="1" r:id="rIdyk1cl2bldypbuncxmnqm7">
+            <w:hyperlink w:history="1" r:id="rIdbmxsbf36aih-n-5vlponk">
               <w:r>
                 <w:rPr>
                   <w:rFonts w:ascii="Arial" w:cs="Arial" w:eastAsia="Arial" w:hAnsi="Arial"/>
@@ -21393,7 +21393,7 @@
             <w:pPr>
               <w:spacing w:after="20" w:before="0"/>
             </w:pPr>
-            <w:hyperlink w:history="1" r:id="rIda9fosovqjgyhdhn9ydgwj">
+            <w:hyperlink w:history="1" r:id="rIdtteajtzyc9arsw8c7lftq">
               <w:r>
                 <w:rPr>
                   <w:rFonts w:ascii="Arial" w:cs="Arial" w:eastAsia="Arial" w:hAnsi="Arial"/>
@@ -21442,7 +21442,7 @@
               <w:spacing w:after="10" w:before="0"/>
               <w:ind w:left="120"/>
             </w:pPr>
-            <w:hyperlink w:history="1" r:id="rIdbjzirlvjudfhkcj_5yu_6">
+            <w:hyperlink w:history="1" r:id="rIddss0tpistm-1dla7yk82k">
               <w:r>
                 <w:rPr>
                   <w:rFonts w:ascii="Arial" w:cs="Arial" w:eastAsia="Arial" w:hAnsi="Arial"/>
@@ -21487,7 +21487,7 @@
             <w:pPr>
               <w:spacing w:after="20" w:before="0"/>
             </w:pPr>
-            <w:hyperlink w:history="1" r:id="rId5v-wkwmjudjq6uu_gztjo">
+            <w:hyperlink w:history="1" r:id="rIdjtundggrxbg4htd-zp9hl">
               <w:r>
                 <w:rPr>
                   <w:rFonts w:ascii="Arial" w:cs="Arial" w:eastAsia="Arial" w:hAnsi="Arial"/>
@@ -21536,7 +21536,7 @@
               <w:spacing w:after="10" w:before="0"/>
               <w:ind w:left="120"/>
             </w:pPr>
-            <w:hyperlink w:history="1" r:id="rIdvjmdh_bhr4vfm3q4zbxno">
+            <w:hyperlink w:history="1" r:id="rIdvyxvi8jar9ywhlcukut5h">
               <w:r>
                 <w:rPr>
                   <w:rFonts w:ascii="Arial" w:cs="Arial" w:eastAsia="Arial" w:hAnsi="Arial"/>
@@ -21731,7 +21731,7 @@
             <w:pPr>
               <w:spacing w:after="20" w:before="0"/>
             </w:pPr>
-            <w:hyperlink w:history="1" r:id="rIdp1ueidz2a1aosz8bl70oi">
+            <w:hyperlink w:history="1" r:id="rIdijuwihpgubbxupaftae7h">
               <w:r>
                 <w:rPr>
                   <w:rFonts w:ascii="Arial" w:cs="Arial" w:eastAsia="Arial" w:hAnsi="Arial"/>
@@ -21764,7 +21764,7 @@
               <w:spacing w:after="10" w:before="0"/>
               <w:ind w:left="120"/>
             </w:pPr>
-            <w:hyperlink w:history="1" r:id="rIdspqtg2hjalhx-tgllkryu">
+            <w:hyperlink w:history="1" r:id="rIdixhrycwq7fc5jnvub7pwb">
               <w:r>
                 <w:rPr>
                   <w:rFonts w:ascii="Arial" w:cs="Arial" w:eastAsia="Arial" w:hAnsi="Arial"/>
@@ -21809,7 +21809,7 @@
             <w:pPr>
               <w:spacing w:after="20" w:before="0"/>
             </w:pPr>
-            <w:hyperlink w:history="1" r:id="rIduz7x40dthlctnfqgh2yz5">
+            <w:hyperlink w:history="1" r:id="rId5o3esqubcprjxlkvtgz8r">
               <w:r>
                 <w:rPr>
                   <w:rFonts w:ascii="Arial" w:cs="Arial" w:eastAsia="Arial" w:hAnsi="Arial"/>
@@ -21858,7 +21858,7 @@
               <w:spacing w:after="10" w:before="0"/>
               <w:ind w:left="120"/>
             </w:pPr>
-            <w:hyperlink w:history="1" r:id="rIdim_smcyzmmwwj92srztj3">
+            <w:hyperlink w:history="1" r:id="rIdkchwmuo-8peh313tmouvd">
               <w:r>
                 <w:rPr>
                   <w:rFonts w:ascii="Arial" w:cs="Arial" w:eastAsia="Arial" w:hAnsi="Arial"/>
@@ -22053,7 +22053,7 @@
             <w:pPr>
               <w:spacing w:after="20" w:before="0"/>
             </w:pPr>
-            <w:hyperlink w:history="1" r:id="rIdpzk45vpm3rrlh0m1qbbit">
+            <w:hyperlink w:history="1" r:id="rIdn1pcufzrmzpzugr-bu0kh">
               <w:r>
                 <w:rPr>
                   <w:rFonts w:ascii="Arial" w:cs="Arial" w:eastAsia="Arial" w:hAnsi="Arial"/>
@@ -22086,7 +22086,7 @@
               <w:spacing w:after="10" w:before="0"/>
               <w:ind w:left="120"/>
             </w:pPr>
-            <w:hyperlink w:history="1" r:id="rId7dh2gwjtfu90govgc-h0c">
+            <w:hyperlink w:history="1" r:id="rIdqlzbpna43a4xlpozdp-sv">
               <w:r>
                 <w:rPr>
                   <w:rFonts w:ascii="Arial" w:cs="Arial" w:eastAsia="Arial" w:hAnsi="Arial"/>
@@ -22131,7 +22131,7 @@
             <w:pPr>
               <w:spacing w:after="20" w:before="0"/>
             </w:pPr>
-            <w:hyperlink w:history="1" r:id="rId9xjl9jde8li1gpup8m3lb">
+            <w:hyperlink w:history="1" r:id="rIdrww_boescxdurougsginw">
               <w:r>
                 <w:rPr>
                   <w:rFonts w:ascii="Arial" w:cs="Arial" w:eastAsia="Arial" w:hAnsi="Arial"/>
@@ -22164,7 +22164,7 @@
               <w:spacing w:after="10" w:before="0"/>
               <w:ind w:left="120"/>
             </w:pPr>
-            <w:hyperlink w:history="1" r:id="rIdmxumx9pw-xnljzf2-bl7p">
+            <w:hyperlink w:history="1" r:id="rIdlzqzb8ugh9shoqzoreihd">
               <w:r>
                 <w:rPr>
                   <w:rFonts w:ascii="Arial" w:cs="Arial" w:eastAsia="Arial" w:hAnsi="Arial"/>
@@ -22676,7 +22676,7 @@
         </w:rPr>
         <w:t xml:space="preserve">© 2026 SeaVuria and ARES. Aligned with KICD objectives. Developed by SeaVuria; technical implementation by ARES (with AI assistance from Claude). Licensed under </w:t>
       </w:r>
-      <w:hyperlink w:history="1" r:id="rIdbz6sm5v99m5ifidg2nfr8">
+      <w:hyperlink w:history="1" r:id="rIdppyeg5fseodhmcvlcddtq">
         <w:r>
           <w:rPr>
             <w:rFonts w:ascii="Arial" w:cs="Arial" w:eastAsia="Arial" w:hAnsi="Arial"/>
@@ -22697,7 +22697,7 @@
         </w:rPr>
         <w:t xml:space="preserve"> (</w:t>
       </w:r>
-      <w:hyperlink w:history="1" r:id="rIdjg_7nlz_r8vnvwkdjwvxu">
+      <w:hyperlink w:history="1" r:id="rIdlm3vce2v5bbquor9ebjmf">
         <w:r>
           <w:rPr>
             <w:rFonts w:ascii="Arial" w:cs="Arial" w:eastAsia="Arial" w:hAnsi="Arial"/>
@@ -23710,7 +23710,7 @@
             <w:pPr>
               <w:spacing w:after="20" w:before="0"/>
             </w:pPr>
-            <w:hyperlink w:history="1" r:id="rIdm6esv1_6xvnnxorleoinq">
+            <w:hyperlink w:history="1" r:id="rIdgthzl1njya5qyndyunbiq">
               <w:r>
                 <w:rPr>
                   <w:rFonts w:ascii="Arial" w:cs="Arial" w:eastAsia="Arial" w:hAnsi="Arial"/>
@@ -23759,7 +23759,7 @@
               <w:spacing w:after="10" w:before="0"/>
               <w:ind w:left="120"/>
             </w:pPr>
-            <w:hyperlink w:history="1" r:id="rIdfcmpw4cyuhnwveppbo2xb">
+            <w:hyperlink w:history="1" r:id="rIdinv3pqnznx40etph6mfnk">
               <w:r>
                 <w:rPr>
                   <w:rFonts w:ascii="Arial" w:cs="Arial" w:eastAsia="Arial" w:hAnsi="Arial"/>
@@ -23804,7 +23804,7 @@
             <w:pPr>
               <w:spacing w:after="20" w:before="0"/>
             </w:pPr>
-            <w:hyperlink w:history="1" r:id="rIdixtvnd_vlckzhcdrlbolj">
+            <w:hyperlink w:history="1" r:id="rIdzm_feg-a4sy8yxyvtnfkd">
               <w:r>
                 <w:rPr>
                   <w:rFonts w:ascii="Arial" w:cs="Arial" w:eastAsia="Arial" w:hAnsi="Arial"/>
@@ -23837,7 +23837,7 @@
               <w:spacing w:after="10" w:before="0"/>
               <w:ind w:left="120"/>
             </w:pPr>
-            <w:hyperlink w:history="1" r:id="rIdpriteqkexofycj53xcrd5">
+            <w:hyperlink w:history="1" r:id="rIdmuddaj8qqpfj_mvx8wnj-">
               <w:r>
                 <w:rPr>
                   <w:rFonts w:ascii="Arial" w:cs="Arial" w:eastAsia="Arial" w:hAnsi="Arial"/>
@@ -24032,7 +24032,7 @@
             <w:pPr>
               <w:spacing w:after="20" w:before="0"/>
             </w:pPr>
-            <w:hyperlink w:history="1" r:id="rIdlfhkegryehnwz8w165fwk">
+            <w:hyperlink w:history="1" r:id="rIdg4qmy12qipvtkp3x2o3js">
               <w:r>
                 <w:rPr>
                   <w:rFonts w:ascii="Arial" w:cs="Arial" w:eastAsia="Arial" w:hAnsi="Arial"/>
@@ -24081,7 +24081,7 @@
               <w:spacing w:after="10" w:before="0"/>
               <w:ind w:left="120"/>
             </w:pPr>
-            <w:hyperlink w:history="1" r:id="rIdmsiaueaiduqqo7h0z6vsb">
+            <w:hyperlink w:history="1" r:id="rId8q4inbyufqgrhanrhhh7c">
               <w:r>
                 <w:rPr>
                   <w:rFonts w:ascii="Arial" w:cs="Arial" w:eastAsia="Arial" w:hAnsi="Arial"/>
@@ -24126,7 +24126,7 @@
             <w:pPr>
               <w:spacing w:after="20" w:before="0"/>
             </w:pPr>
-            <w:hyperlink w:history="1" r:id="rIdqzs6pr0e_s5z9mliqateg">
+            <w:hyperlink w:history="1" r:id="rIdvik3fxpx0_dbt2qlstghm">
               <w:r>
                 <w:rPr>
                   <w:rFonts w:ascii="Arial" w:cs="Arial" w:eastAsia="Arial" w:hAnsi="Arial"/>
@@ -24159,7 +24159,7 @@
               <w:spacing w:after="10" w:before="0"/>
               <w:ind w:left="120"/>
             </w:pPr>
-            <w:hyperlink w:history="1" r:id="rIdwmxle0hhdsn4mvbp1-kj1">
+            <w:hyperlink w:history="1" r:id="rId7pv5azbbstnogzdlf6eo_">
               <w:r>
                 <w:rPr>
                   <w:rFonts w:ascii="Arial" w:cs="Arial" w:eastAsia="Arial" w:hAnsi="Arial"/>
@@ -24354,7 +24354,7 @@
             <w:pPr>
               <w:spacing w:after="20" w:before="0"/>
             </w:pPr>
-            <w:hyperlink w:history="1" r:id="rIdhbwhaipfyft7vt1bjovjr">
+            <w:hyperlink w:history="1" r:id="rIdfxmf0nqghl95w2z3mud6m">
               <w:r>
                 <w:rPr>
                   <w:rFonts w:ascii="Arial" w:cs="Arial" w:eastAsia="Arial" w:hAnsi="Arial"/>
@@ -24403,7 +24403,7 @@
               <w:spacing w:after="10" w:before="0"/>
               <w:ind w:left="120"/>
             </w:pPr>
-            <w:hyperlink w:history="1" r:id="rIdiy3bd7r2kgdqhpxjp6bkr">
+            <w:hyperlink w:history="1" r:id="rIdruzkt8ywux5pdk7zu27x3">
               <w:r>
                 <w:rPr>
                   <w:rFonts w:ascii="Arial" w:cs="Arial" w:eastAsia="Arial" w:hAnsi="Arial"/>
@@ -24448,7 +24448,7 @@
             <w:pPr>
               <w:spacing w:after="20" w:before="0"/>
             </w:pPr>
-            <w:hyperlink w:history="1" r:id="rId9yvq_gssy5xvprthbrqfa">
+            <w:hyperlink w:history="1" r:id="rIdb25lv3teivo4catwgscza">
               <w:r>
                 <w:rPr>
                   <w:rFonts w:ascii="Arial" w:cs="Arial" w:eastAsia="Arial" w:hAnsi="Arial"/>
@@ -24481,7 +24481,7 @@
               <w:spacing w:after="10" w:before="0"/>
               <w:ind w:left="120"/>
             </w:pPr>
-            <w:hyperlink w:history="1" r:id="rIdessremynx10m3mwpqnznm">
+            <w:hyperlink w:history="1" r:id="rIdbd0a817wfg6z6mlff7ahp">
               <w:r>
                 <w:rPr>
                   <w:rFonts w:ascii="Arial" w:cs="Arial" w:eastAsia="Arial" w:hAnsi="Arial"/>
@@ -24676,7 +24676,7 @@
             <w:pPr>
               <w:spacing w:after="20" w:before="0"/>
             </w:pPr>
-            <w:hyperlink w:history="1" r:id="rIdutezyggjhvo-wmakoq5y3">
+            <w:hyperlink w:history="1" r:id="rIdjifagtmokybd8wrfdr8c5">
               <w:r>
                 <w:rPr>
                   <w:rFonts w:ascii="Arial" w:cs="Arial" w:eastAsia="Arial" w:hAnsi="Arial"/>
@@ -24725,7 +24725,7 @@
               <w:spacing w:after="10" w:before="0"/>
               <w:ind w:left="120"/>
             </w:pPr>
-            <w:hyperlink w:history="1" r:id="rIdelgqn5_mfczw3kvxwybu1">
+            <w:hyperlink w:history="1" r:id="rIdgzhb43cbebio9kedbll7m">
               <w:r>
                 <w:rPr>
                   <w:rFonts w:ascii="Arial" w:cs="Arial" w:eastAsia="Arial" w:hAnsi="Arial"/>
@@ -24770,7 +24770,7 @@
             <w:pPr>
               <w:spacing w:after="20" w:before="0"/>
             </w:pPr>
-            <w:hyperlink w:history="1" r:id="rIddqo8evpwedmlwubfr7urr">
+            <w:hyperlink w:history="1" r:id="rIdps6dxjwkygngfmecobs1e">
               <w:r>
                 <w:rPr>
                   <w:rFonts w:ascii="Arial" w:cs="Arial" w:eastAsia="Arial" w:hAnsi="Arial"/>
@@ -24803,7 +24803,7 @@
               <w:spacing w:after="10" w:before="0"/>
               <w:ind w:left="120"/>
             </w:pPr>
-            <w:hyperlink w:history="1" r:id="rIds7ftsl-0qwzextfr0raqw">
+            <w:hyperlink w:history="1" r:id="rId52y-zjkagyoooo6p3fa-y">
               <w:r>
                 <w:rPr>
                   <w:rFonts w:ascii="Arial" w:cs="Arial" w:eastAsia="Arial" w:hAnsi="Arial"/>
@@ -24998,7 +24998,7 @@
             <w:pPr>
               <w:spacing w:after="20" w:before="0"/>
             </w:pPr>
-            <w:hyperlink w:history="1" r:id="rIdjlntoqge41kqurmjcaf15">
+            <w:hyperlink w:history="1" r:id="rIdrh6pr3xxz1fegkevbbpom">
               <w:r>
                 <w:rPr>
                   <w:rFonts w:ascii="Arial" w:cs="Arial" w:eastAsia="Arial" w:hAnsi="Arial"/>
@@ -25047,7 +25047,7 @@
               <w:spacing w:after="10" w:before="0"/>
               <w:ind w:left="120"/>
             </w:pPr>
-            <w:hyperlink w:history="1" r:id="rIdyhk4iqez_05vhcfwprm0k">
+            <w:hyperlink w:history="1" r:id="rIdpv7h9rb7fs0shdo3ytazc">
               <w:r>
                 <w:rPr>
                   <w:rFonts w:ascii="Arial" w:cs="Arial" w:eastAsia="Arial" w:hAnsi="Arial"/>
@@ -25092,7 +25092,7 @@
             <w:pPr>
               <w:spacing w:after="20" w:before="0"/>
             </w:pPr>
-            <w:hyperlink w:history="1" r:id="rIdeut-j19vhulrtgzgqliz2">
+            <w:hyperlink w:history="1" r:id="rIdllvy9smgov-x4p2khypwh">
               <w:r>
                 <w:rPr>
                   <w:rFonts w:ascii="Arial" w:cs="Arial" w:eastAsia="Arial" w:hAnsi="Arial"/>
@@ -25125,7 +25125,7 @@
               <w:spacing w:after="10" w:before="0"/>
               <w:ind w:left="120"/>
             </w:pPr>
-            <w:hyperlink w:history="1" r:id="rId6d5fhdxnvw5odwilphuc5">
+            <w:hyperlink w:history="1" r:id="rIdoetrk0gdcaet4iyfptji7">
               <w:r>
                 <w:rPr>
                   <w:rFonts w:ascii="Arial" w:cs="Arial" w:eastAsia="Arial" w:hAnsi="Arial"/>
@@ -25637,7 +25637,7 @@
         </w:rPr>
         <w:t xml:space="preserve">© 2026 SeaVuria and ARES. Aligned with KICD objectives. Developed by SeaVuria; technical implementation by ARES (with AI assistance from Claude). Licensed under </w:t>
       </w:r>
-      <w:hyperlink w:history="1" r:id="rIdgrlmvl0q2l7syu_m-8yip">
+      <w:hyperlink w:history="1" r:id="rId70stdj_vgrzsrjwtldawb">
         <w:r>
           <w:rPr>
             <w:rFonts w:ascii="Arial" w:cs="Arial" w:eastAsia="Arial" w:hAnsi="Arial"/>
@@ -25658,7 +25658,7 @@
         </w:rPr>
         <w:t xml:space="preserve"> (</w:t>
       </w:r>
-      <w:hyperlink w:history="1" r:id="rIdqy2gqmsorkcimp8lssudc">
+      <w:hyperlink w:history="1" r:id="rIdajn4tyfg0ifx9220yde5c">
         <w:r>
           <w:rPr>
             <w:rFonts w:ascii="Arial" w:cs="Arial" w:eastAsia="Arial" w:hAnsi="Arial"/>

</xml_diff>